<commit_message>
Add compiler name and organization to PDF and DOCX
Cover, footer, credits and file metadata now name Raqi Faisal Ahmed
Sabit and Al Quranic Ruqyah Healing.

Co-Authored-By: Claude Opus 5.5 <noreply@anthropic.com>
Claude-Session: https://claude.ai/code/session_018ptrxaVVGiuziy5uevKjkm
</commit_message>
<xml_diff>
--- a/masnun-amal/sokal-sondha-rater-masnun-amal.docx
+++ b/masnun-amal/sokal-sondha-rater-masnun-amal.docx
@@ -139,11 +139,15 @@
     </w:p>
     <w:p>
       <w:pPr>
-        <w:spacing w:before="1200"/>
-      </w:pPr>
-    </w:p>
-    <w:p>
-      <w:pPr>
+        <w:spacing w:before="700"/>
+      </w:pPr>
+    </w:p>
+    <w:p>
+      <w:pPr>
+        <w:pBdr>
+          <w:top w:val="single" w:color="B08A3E" w:sz="8" w:space="4"/>
+        </w:pBdr>
+        <w:ind w:left="2200" w:right="2200"/>
         <w:jc w:val="center"/>
       </w:pPr>
       <w:r>
@@ -153,7 +157,53 @@
           <w:sz w:val="20"/>
           <w:szCs w:val="20"/>
         </w:rPr>
-        <w:t xml:space="preserve">সংকলন: অক্টোবর ২০২৬</w:t>
+        <w:t xml:space="preserve">সংকলন ও বিন্যাস</w:t>
+      </w:r>
+    </w:p>
+    <w:p>
+      <w:pPr>
+        <w:jc w:val="center"/>
+      </w:pPr>
+      <w:r>
+        <w:rPr>
+          <w:rFonts w:ascii="Hind Siliguri" w:cs="Hind Siliguri" w:eastAsia="Hind Siliguri" w:hAnsi="Hind Siliguri"/>
+          <w:b/>
+          <w:bCs/>
+          <w:color w:val="1D5A45"/>
+          <w:sz w:val="34"/>
+          <w:szCs w:val="34"/>
+        </w:rPr>
+        <w:t xml:space="preserve">Raqi Faisal Ahmed Sabit</w:t>
+      </w:r>
+    </w:p>
+    <w:p>
+      <w:pPr>
+        <w:jc w:val="center"/>
+      </w:pPr>
+      <w:r>
+        <w:rPr>
+          <w:rFonts w:ascii="Hind Siliguri" w:cs="Hind Siliguri" w:eastAsia="Hind Siliguri" w:hAnsi="Hind Siliguri"/>
+          <w:b/>
+          <w:bCs/>
+          <w:color w:val="7A5A17"/>
+          <w:sz w:val="27"/>
+          <w:szCs w:val="27"/>
+        </w:rPr>
+        <w:t xml:space="preserve">Al Quranic Ruqyah Healing</w:t>
+      </w:r>
+    </w:p>
+    <w:p>
+      <w:pPr>
+        <w:jc w:val="center"/>
+      </w:pPr>
+      <w:r>
+        <w:rPr>
+          <w:rFonts w:ascii="Hind Siliguri" w:cs="Hind Siliguri" w:eastAsia="Hind Siliguri" w:hAnsi="Hind Siliguri"/>
+          <w:color w:val="5B6660"/>
+          <w:sz w:val="20"/>
+          <w:szCs w:val="20"/>
+        </w:rPr>
+        <w:t xml:space="preserve">অক্টোবর ২০২৬</w:t>
       </w:r>
     </w:p>
     <w:p>
@@ -27230,6 +27280,25 @@
           <w:sz w:val="22"/>
           <w:szCs w:val="22"/>
         </w:rPr>
+        <w:t xml:space="preserve">সংকলন ও বিন্যাস: Raqi Faisal Ahmed Sabit, Al Quranic Ruqyah Healing।</w:t>
+      </w:r>
+    </w:p>
+    <w:p>
+      <w:pPr>
+        <w:pStyle w:val="ListParagraph"/>
+        <w:numPr>
+          <w:ilvl w:val="0"/>
+          <w:numId w:val="2"/>
+        </w:numPr>
+        <w:spacing w:after="60"/>
+        <w:jc w:val="both"/>
+      </w:pPr>
+      <w:r>
+        <w:rPr>
+          <w:rFonts w:ascii="Hind Siliguri" w:cs="Hind Siliguri" w:eastAsia="Hind Siliguri" w:hAnsi="Hind Siliguri"/>
+          <w:sz w:val="22"/>
+          <w:szCs w:val="22"/>
+        </w:rPr>
         <w:t xml:space="preserve">আল-কুরআনুল কারীম: আরবি পাঠ ইন্দো-পাক লিপিতে quran.com (Quran Foundation) থেকে। বাংলা অর্থ ড. আবু বকর মুহাম্মাদ যাকারিয়ার অনুবাদ থেকে (টীকা-নম্বর বাদ দেওয়া হয়েছে)।</w:t>
       </w:r>
     </w:p>
@@ -27398,7 +27467,7 @@
         <w:sz w:val="16"/>
         <w:szCs w:val="16"/>
       </w:rPr>
-      <w:t xml:space="preserve">সকাল-সন্ধ্যা ও রাতের মাসনূন আমল   •   পৃষ্ঠা </w:t>
+      <w:t xml:space="preserve">সকাল-সন্ধ্যা ও রাতের মাসনূন আমল   •   Al Quranic Ruqyah Healing   •   পৃষ্ঠা </w:t>
     </w:r>
     <w:r>
       <w:rPr>

</xml_diff>